<commit_message>
Fix generator movement coordinate types in batell v0.3.4
</commit_message>
<xml_diff>
--- a/reports/batell-v0.3.2-turn-skip-incident-management.docx
+++ b/reports/batell-v0.3.2-turn-skip-incident-management.docx
@@ -51,7 +51,7 @@
     </w:p>
     <w:p>
       <w:r>
-        <w:t>Сервер ожидал две минуты до разрешения пропуска, но сохранял статус отсутствующего игрока как онлайн пять минут. После передачи хода движение генерала блокировалось по правилам, однако пользователь не получал объяснения.</w:t>
+        <w:t>Сервер ожидал две минуты до разрешения пропуска, но сохранял статус отсутствующего игрока как онлайн пять минут. Отдельно карта возвращала координаты строками, а строгий API перемещения принимал только целые числа, поэтому команда движения отклонялась.</w:t>
       </w:r>
     </w:p>
     <w:p>
@@ -64,7 +64,7 @@
     </w:p>
     <w:p>
       <w:r>
-        <w:t>Окно присутствия согласовано с двухминутным ожиданием. Интерфейс показывает имена ожидаемых игроков, обратный отсчёт и адресную кнопку пропуска офлайн-игрока. Добавлено объяснение блокировки движения после завершения хода.</w:t>
+        <w:t>Окно присутствия согласовано с двухминутным ожиданием. Интерфейс показывает имена ожидаемых игроков, обратный отсчёт и адресную кнопку пропуска офлайн-игрока. Координаты гекса преобразуются в числа перед отправкой команды движения.</w:t>
       </w:r>
     </w:p>
     <w:p>
@@ -77,7 +77,7 @@
     </w:p>
     <w:p>
       <w:r>
-        <w:t>Исправление опубликовано как batell v0.3.3 на основном тестовом VDS. Автоматические и инфраструктурные проверки прошли. Dev-копия не изменялась. Требуется игровая проверка пользователем.</w:t>
+        <w:t>Исправление движения подготовлено как batell v0.3.4. Автоматические проверки прошли. Dev-копия не изменяется. Требуется публикация на основном тестовом VDS и игровая проверка пользователем.</w:t>
       </w:r>
     </w:p>
     <w:p>

</xml_diff>